<commit_message>
Release v2.0.0: customization, EPG guide upgrade, resume, complete backup, in-app updates, TV performance overhaul
Highlights: per-profile content customization; full-lineup lazy EPG with search and
tune-from-guide; resume prompts (Always/Ask/Never); selective backup & restore with
restore-at-setup; in-app updates from GitHub Releases with startup status card; custom
accent colors (palette + hex); direct-to-display TV rendering (smooth 4K HDR on budget
panels) with device-scaled memory and a decode watchdog; complete D-pad focus rewiring.
See CHANGELOG.md for the full list.
</commit_message>
<xml_diff>
--- a/extras/OwnTV_Complete_Brief_Plan_With_Logo.docx
+++ b/extras/OwnTV_Complete_Brief_Plan_With_Logo.docx
@@ -2628,6 +2628,435 @@
         <w:rPr>
           <w:rFonts w:ascii="Cambria" w:hAnsi="Cambria" w:eastAsia="Cambria" w:cs="Cambria"/>
         </w:rPr>
+      </w:r>
+    </w:p>
+    <w:p>
+      <w:pPr>
+        <w:pStyle w:val="693"/>
+      </w:pPr>
+      <w:r>
+        <w:t>12. Post-1.0 Updates (v2.0.0, June 2026)</w:t>
+      </w:r>
+    </w:p>
+    <w:p>
+      <w:r>
+        <w:t>Shipped after the v1.0.0 release, driven by community feedback. These supersede earlier sections where they differ.</w:t>
+      </w:r>
+    </w:p>
+    <w:p>
+      <w:pPr>
+        <w:pStyle w:val="694"/>
+      </w:pPr>
+      <w:r>
+        <w:t>12.1 Playlist-order sorting</w:t>
+      </w:r>
+    </w:p>
+    <w:p>
+      <w:pPr>
+        <w:pStyle w:val="723"/>
+      </w:pPr>
+      <w:r>
+        <w:t>Sync now records the provider's original order (channels, movies, series, and categories — including M3U group order), instead of discarding it.</w:t>
+      </w:r>
+    </w:p>
+    <w:p>
+      <w:pPr>
+        <w:pStyle w:val="723"/>
+      </w:pPr>
+      <w:r>
+        <w:t>Each browse section (Live TV / Movies / Series) has a sort chip next to its search bar toggling Playlist/Provider order vs A–Z, persisted per section. Live TV defaults to playlist order.</w:t>
+      </w:r>
+    </w:p>
+    <w:p>
+      <w:pPr>
+        <w:pStyle w:val="694"/>
+      </w:pPr>
+      <w:r>
+        <w:t>12.2 Category rail: full names + performance</w:t>
+      </w:r>
+    </w:p>
+    <w:p>
+      <w:pPr>
+        <w:pStyle w:val="723"/>
+      </w:pPr>
+      <w:r>
+        <w:t>The category rail expands on focus (like the main sidebar) to show full category names; Favorites/History show icon + label. Collapsed, it stays the compact abbreviation rail.</w:t>
+      </w:r>
+    </w:p>
+    <w:p>
+      <w:pPr>
+        <w:pStyle w:val="723"/>
+      </w:pPr>
+      <w:r>
+        <w:t>Performance: the rail is virtualized (LazyColumn — only visible pills compose) and the expansion is drawn as a z-index overlay over the content pane, so the channel grid is never re-laid-out during the animation. Smooth with hundreds of categories.</w:t>
+      </w:r>
+    </w:p>
+    <w:p>
+      <w:pPr>
+        <w:pStyle w:val="694"/>
+      </w:pPr>
+      <w:r>
+        <w:t>12.3 Content customization (TiviMate-style, per profile)</w:t>
+      </w:r>
+    </w:p>
+    <w:p>
+      <w:pPr>
+        <w:pStyle w:val="723"/>
+      </w:pPr>
+      <w:r>
+        <w:t>Hide, rename, and reorder categories (Live TV / Movies / Series) from Settings → Customize; hide and rename channels straight from the Live preview pane. A Hidden-channels list allows unhiding.</w:t>
+      </w:r>
+    </w:p>
+    <w:p>
+      <w:pPr>
+        <w:pStyle w:val="723"/>
+      </w:pPr>
+      <w:r>
+        <w:t>Stored per profile in DataStore (deliberately not a Room table — the DB uses destructive migrations) and keyed on stable provider ids (Xtream stream/category ids; M3U falls back to names), so edits survive every re-sync.</w:t>
+      </w:r>
+    </w:p>
+    <w:p>
+      <w:pPr>
+        <w:pStyle w:val="723"/>
+      </w:pPr>
+      <w:r>
+        <w:t>Hidden channels disappear everywhere: lists, folders, favorites, section search, global search, recently watched, and the EPG guide. Renames show everywhere they appear.</w:t>
+      </w:r>
+    </w:p>
+    <w:p>
+      <w:pPr>
+        <w:pStyle w:val="723"/>
+      </w:pPr>
+      <w:r>
+        <w:t>Customizations are included in Backup &amp; Restore (backup format v2; profile/source ids are preserved on restore, so keys remain valid).</w:t>
+      </w:r>
+    </w:p>
+    <w:p>
+      <w:pPr>
+        <w:pStyle w:val="694"/>
+      </w:pPr>
+      <w:r>
+        <w:t>12.4 Infrastructure</w:t>
+      </w:r>
+    </w:p>
+    <w:p>
+      <w:pPr>
+        <w:pStyle w:val="723"/>
+      </w:pPr>
+      <w:r>
+        <w:t>GitHub repository published (github.com/ahXN00/OwnTV, MIT) with CI: every push builds a debug APK artifact; v* tags build a signed release APK and publish a GitHub Release. Versioning is derived from the git tag — no manual build-file edits.</w:t>
+      </w:r>
+    </w:p>
+    <w:p>
+      <w:pPr>
+        <w:pStyle w:val="723"/>
+      </w:pPr>
+      <w:r>
+        <w:t>Coil image loading routed through the app's OkHttp client with a player-style User-Agent (fixes providers rejecting stock UAs); offline detection banner; friendly offline-aware error messages on import/sync/guide.</w:t>
+      </w:r>
+    </w:p>
+    <w:p>
+      <w:pPr>
+        <w:pStyle w:val="694"/>
+      </w:pPr>
+      <w:r>
+        <w:t>12.5 EPG enhancements</w:t>
+      </w:r>
+    </w:p>
+    <w:p>
+      <w:pPr>
+        <w:pStyle w:val="723"/>
+      </w:pPr>
+      <w:r>
+        <w:t>Custom EPG URL per source — for Xtream AND M3U; a manually entered XMLTV URL always overrides the defaults (Xtream xmltv.php / M3U url-tvg). Editable in the add/edit source form.</w:t>
+      </w:r>
+    </w:p>
+    <w:p>
+      <w:pPr>
+        <w:pStyle w:val="723"/>
+      </w:pPr>
+      <w:r>
+        <w:t>Tune from the guide: pressing OK on a channel's name cell tunes straight to fullscreen; the programme details dialog gained a 'Watch channel' button. Watching records history.</w:t>
+      </w:r>
+    </w:p>
+    <w:p>
+      <w:pPr>
+        <w:pStyle w:val="723"/>
+      </w:pPr>
+      <w:r>
+        <w:t>Visible EPG status: the Guide header shows 'Guide loaded: N channels · M programmes' once data is stored, and each source row in Settings → Sources shows 'EPG ✓ &lt;count&gt;' or 'not downloaded'.</w:t>
+      </w:r>
+    </w:p>
+    <w:p>
+      <w:pPr>
+        <w:pStyle w:val="723"/>
+      </w:pPr>
+      <w:r>
+        <w:t>Guide matching hardened: the grid selects only channels that actually have programmes in the window, with case/whitespace-insensitive EPG-id matching (XMLTV ids often differ from panel ids in case).</w:t>
+      </w:r>
+    </w:p>
+    <w:p>
+      <w:pPr>
+        <w:pStyle w:val="694"/>
+      </w:pPr>
+      <w:r>
+        <w:t>12.6 Player stability</w:t>
+      </w:r>
+    </w:p>
+    <w:p>
+      <w:pPr>
+        <w:pStyle w:val="723"/>
+      </w:pPr>
+      <w:r>
+        <w:t>All mpv commands and property writes moved off the UI thread onto a dedicated serialized worker — a stalling stream can no longer freeze input (eliminated 'Input dispatching timed out' ANRs). Track lists are cached per loaded file so the HUD never issues synchronous mpv reads.</w:t>
+      </w:r>
+    </w:p>
+    <w:p>
+      <w:pPr>
+        <w:pStyle w:val="723"/>
+      </w:pPr>
+      <w:r>
+        <w:t>Load coalescing: fast scrolling with live preview queues only the newest channel load; stale loads are skipped and stopping the preview cancels pending loads.</w:t>
+      </w:r>
+    </w:p>
+    <w:p>
+      <w:pPr>
+        <w:pStyle w:val="723"/>
+      </w:pPr>
+      <w:r>
+        <w:t>Single-connection friendliness: preview → fullscreen now reuses the running stream (just unmutes) instead of reloading — no overlapping connections, which tripped strict providers' limits (HTTP 509) and previously led to a blank player. Also makes the transition seamless.</w:t>
+      </w:r>
+    </w:p>
+    <w:p>
+      <w:pPr>
+        <w:pStyle w:val="723"/>
+      </w:pPr>
+      <w:r>
+        <w:t>Live-drop recovery: when a live stream dies mid-play, the player auto-reconnects once after 2s; if that fails too, the error screen with Retry appears instead of a silent blank screen.</w:t>
+      </w:r>
+    </w:p>
+    <w:p>
+      <w:pPr>
+        <w:pStyle w:val="723"/>
+      </w:pPr>
+      <w:r>
+        <w:t>Navigation: the Guide no longer traps the Back button (app exit works from every section); many focus fixes (rename dialogs focus their text field; Settings → Sources restores focus after add/edit/re-sync/failure).</w:t>
+      </w:r>
+    </w:p>
+    <w:p>
+      <w:pPr>
+        <w:pStyle w:val="694"/>
+      </w:pPr>
+      <w:r>
+        <w:t>12.7 Resume playback</w:t>
+      </w:r>
+    </w:p>
+    <w:p>
+      <w:pPr/>
+      <w:r>
+        <w:t>Movies and series episodes save their position every 10 seconds (episode saving was new — previously positions were read but never written). Replaying an item with a saved position shows a compact, semi-transparent prompt: “Resume at 23:45?” with Resume / Start over. A Video Player setting picks the behavior: Always resume, Ask to resume (default), or Never resume.</w:t>
+      </w:r>
+    </w:p>
+    <w:p>
+      <w:pPr>
+        <w:pStyle w:val="694"/>
+      </w:pPr>
+      <w:r>
+        <w:t>12.8 Complete backup &amp; in-app updates</w:t>
+      </w:r>
+    </w:p>
+    <w:p>
+      <w:pPr>
+        <w:pStyle w:val="723"/>
+      </w:pPr>
+      <w:r>
+        <w:t>Backup &amp; Restore now exports everything: profiles, sources, customizations, favorites, watch history, and resume positions. User data is stored under stable keys (source + remote id/name) and re-attaches automatically after the restored sources re-sync; episode records attach when the show is opened. Profile/source ids are preserved on restore.</w:t>
+      </w:r>
+    </w:p>
+    <w:p>
+      <w:pPr>
+        <w:pStyle w:val="723"/>
+      </w:pPr>
+      <w:r>
+        <w:t>In-app updates straight from GitHub Releases — no update server. The app checks the latest release on startup (toggleable in Settings) or manually via Settings → Check for updates; an update window shows the full changelog (the release body, which CI fills from CHANGELOG.md) with Update now / Later. The APK downloads with progress into app-private storage (no storage permission) and is handed to the system installer via FileProvider (REQUEST_INSTALL_PACKAGES).</w:t>
+      </w:r>
+    </w:p>
+    <w:p>
+      <w:pPr>
+        <w:pStyle w:val="723"/>
+      </w:pPr>
+      <w:r>
+        <w:t>Settings “About” rework: browser-redirect rows (Star on GitHub / Report a bug) removed — TV browsers are impractical — replaced by an App group with Check for updates, the startup-check toggle, and an About dialog (version, license, author, project URL).</w:t>
+      </w:r>
+    </w:p>
+    <w:p>
+      <w:pPr>
+        <w:pStyle w:val="694"/>
+      </w:pPr>
+      <w:r>
+        <w:t>12.9 D-pad focus hardening</w:t>
+      </w:r>
+    </w:p>
+    <w:p>
+      <w:pPr/>
+      <w:r>
+        <w:t>Three rounds of fixes so D-pad movement always lands somewhere sensible instead of whatever is horizontally aligned:</w:t>
+      </w:r>
+    </w:p>
+    <w:p>
+      <w:pPr>
+        <w:pStyle w:val="723"/>
+      </w:pPr>
+      <w:r>
+        <w:t>Entering the sidebar lands on the current section; entering the category rail lands on the selected folder.</w:t>
+      </w:r>
+    </w:p>
+    <w:p>
+      <w:pPr>
+        <w:pStyle w:val="723"/>
+      </w:pPr>
+      <w:r>
+        <w:t>Entering a content pane (Live / Movies / Series) lands on the last-focused item, falling back to the first item — never the search bar (search stays reachable via D-pad up).</w:t>
+      </w:r>
+    </w:p>
+    <w:p>
+      <w:pPr>
+        <w:pStyle w:val="723"/>
+      </w:pPr>
+      <w:r>
+        <w:t>Every Settings sub-screen (Customize, Sources, Profiles, Backup, Personalization, Video Player) opens with focus on its first control; closing a Settings dialog returns focus to the row that opened it.</w:t>
+      </w:r>
+    </w:p>
+    <w:p>
+      <w:pPr>
+        <w:pStyle w:val="723"/>
+      </w:pPr>
+      <w:r>
+        <w:t>Implementation rule: requestFocus() inside onFocusChanged is rejected mid-transaction — all redirects defer one frame via a coroutine scope.</w:t>
+      </w:r>
+    </w:p>
+    <w:p>
+      <w:pPr>
+        <w:pStyle w:val="694"/>
+      </w:pPr>
+      <w:r>
+        <w:t>12.10 v2.0.0 wrap-up: appearance, selective backup, update UX, focus hardening</w:t>
+      </w:r>
+    </w:p>
+    <w:p>
+      <w:pPr/>
+      <w:r>
+        <w:t>The release grew beyond a 1.1: the Settings information architecture, theming engine, backup flow and update UX all changed, so it shipped as v2.0.0.</w:t>
+      </w:r>
+    </w:p>
+    <w:p>
+      <w:pPr>
+        <w:pStyle w:val="723"/>
+      </w:pPr>
+      <w:r>
+        <w:t>Appearance restructure — the Personalization sub-screen was dissolved. Settings → Appearance now holds Theme (picker dialog), Accent color, and UI Zoom directly; avatars are edited per profile in the Profiles editor.</w:t>
+      </w:r>
+    </w:p>
+    <w:p>
+      <w:pPr>
+        <w:pStyle w:val="723"/>
+      </w:pPr>
+      <w:r>
+        <w:t>Custom accent colors — beyond the 5 presets, a palette (12 hues × 2 shades) and a hex-code field accept any color. The M3 primary roles (primary / onPrimary / container / onContainer) are generated from the seed by pinning HSL lightness per role, for dark and light themes.</w:t>
+      </w:r>
+    </w:p>
+    <w:p>
+      <w:pPr>
+        <w:pStyle w:val="723"/>
+      </w:pPr>
+      <w:r>
+        <w:t>Selective backup &amp; restore — exporting asks which sections to include (profiles &amp; sources, customizations, favorites, history, resume positions, or everything); restoring inspects the file and offers only the sections it contains. Backup format v4 carries a sections manifest; older files are auto-detected.</w:t>
+      </w:r>
+    </w:p>
+    <w:p>
+      <w:pPr>
+        <w:pStyle w:val="723"/>
+      </w:pPr>
+      <w:r>
+        <w:t>Update UX — the automatic startup check (toggleable) shows a small semi-transparent top-right status card: checking → up-to-date (auto-hides ~2 s) or a persistent Update now / Later prompt with download progress. The CI release pipeline fills the GitHub release body from the newest CHANGELOG.md section, which the in-app updater shows as the full “What's new”.</w:t>
+      </w:r>
+    </w:p>
+    <w:p>
+      <w:pPr>
+        <w:pStyle w:val="723"/>
+      </w:pPr>
+      <w:r>
+        <w:t>Focus hardening (rounds 4–7) — search bars are two-stage TV pills (keyboard only on OK); pane entry routing moved from onFocusChanged (which re-fired on internal moves and froze focus) to focusProperties.onEnter; onEnter cooperates with pending dialog-return targets (it intercepts programmatic restores crossing the group boundary); returning from playback refocuses the exact item played, including the tuned channel row in the Guide and the episode within a show; focus restores key on the same loading flags that gate their target's composition.</w:t>
+      </w:r>
+    </w:p>
+    <w:p>
+      <w:pPr>
+        <w:pStyle w:val="694"/>
+      </w:pPr>
+      <w:r>
+        <w:t>12.11 Real-TV performance overhaul: direct rendering &amp; memory discipline</w:t>
+      </w:r>
+    </w:p>
+    <w:p>
+      <w:pPr/>
+      <w:r>
+        <w:t>Testing on a TCL 50C61KS (Realtek RTD6748, PowerVR BXE-4-32, 1.8 GB usable RAM) exposed that the emulator had masked two systemic costs: mpv's GL renderer on Android only supports copy-mode hardware decoding (every 4K frame memcpy'd through the CPU, then HDR tone-mapped in 16-bit-float shaders), and the player's buffers were sized for a desktop-backed emulator. Result on real hardware: 389–620 MB PSS, LOW_MEMORY kills, and 4K video running minutes behind its audio. The fix landed in two waves:</w:t>
+      </w:r>
+    </w:p>
+    <w:p>
+      <w:pPr>
+        <w:pStyle w:val="723"/>
+      </w:pPr>
+      <w:r>
+        <w:t>Direct-to-display rendering (the 'YouTube formula') — on TV-class devices all hardware-decoded playback now uses vo=mediacodec_embed with direct hwdec=mediacodec: the decoder writes frames straight into the display surface. Zero CPU copies, zero GL shader work, native HDR from the panel's own pipeline, faster channel starts (no per-load shader rebuilds). Verified on-device: 4K HDR10, 4K SDR, 1080p and 720p live all decode direct ('hwdec-current=mediacodec').</w:t>
+      </w:r>
+    </w:p>
+    <w:p>
+      <w:pPr>
+        <w:pStyle w:val="723"/>
+      </w:pPr>
+      <w:r>
+        <w:t>App-drawn subtitles — the decoder owns the surface, so mpv can't draw its OSD; the player polls mpv's active subtitle line (sub-text) and a Compose overlay renders it Netflix-style, sized by the existing subtitle-size setting. Audio/subtitle track menus, seeking and resume are unaffected. The video view letterboxes itself to the stream's aspect (4:3 channels stay 4:3).</w:t>
+      </w:r>
+    </w:p>
+    <w:p>
+      <w:pPr>
+        <w:pStyle w:val="723"/>
+      </w:pPr>
+      <w:r>
+        <w:t>Renderer setting (Auto / Quality) — Auto picks direct rendering on TV-class hardware and mpv's full GL renderer elsewhere; Quality forces the GL renderer (complete ASS/PGS subtitle styling, zoom modes) at the user's own risk on weak panels. Automatic per-session fallback to GL if direct output fails on a device.</w:t>
+      </w:r>
+    </w:p>
+    <w:p>
+      <w:pPr>
+        <w:pStyle w:val="723"/>
+      </w:pPr>
+      <w:r>
+        <w:t>Device-tiered memory budget (PlayerBudget) — demuxer cache scales with ActivityManager memory class: 48+16 MB on TV-class devices (was a fixed 256+64 MB), plus profile=fast, rgba8 framebuffers and cheap tone-mapping for the GL path on low-spec GPUs.</w:t>
+      </w:r>
+    </w:p>
+    <w:p>
+      <w:pPr>
+        <w:pStyle w:val="723"/>
+      </w:pPr>
+      <w:r>
+        <w:t>Decode watchdog — polls the active decoder after each load; &gt;1080p content landing on the software decoder aborts with a clear error instead of a memory/thermal death spiral. Software decoding stays available as the rescue path at ≤1080p.</w:t>
+      </w:r>
+    </w:p>
+    <w:p>
+      <w:pPr>
+        <w:pStyle w:val="723"/>
+      </w:pPr>
+      <w:r>
+        <w:t>Lifecycle &amp; pressure hygiene — backgrounding stops the stream and frees decoder/cache memory immediately (the app previously held ~500 MB while invisible and was reaped as an 'empty' process); onTrimMemory live-shrinks the mpv cache and clears Coil's image cache (itself capped at 10%). Playback PSS on the test TV dropped from ~620 MB to well under 200 MB.</w:t>
+      </w:r>
+    </w:p>
+    <w:p>
+      <w:pPr>
+        <w:pStyle w:val="723"/>
+      </w:pPr>
+      <w:r>
+        <w:t>Diagnosis methodology that cracked it (for posterity): ApplicationExitInfo (dumpsys activity exit-info) to classify kills, live filtered logcat captures (small TV ring buffers rotate post-hoc dumps away), and an in-app 'mpv ready' read-back log line to verify both the applied options and the installed build identity.</w:t>
       </w:r>
     </w:p>
     <w:sectPr>

</xml_diff>

<commit_message>
v4.0.0: fixed-grid UI overhaul, Live CC, per-channel mpv compatibility mode, semi-auto EPG, stream info, volume boost, clear history
UI upgrade (community feedback):
- Fixed, roomy layout — nav/category panels no longer expand/collapse; full category labels; app-wide
- Stream technical info overlay in the player (both engines)
- Volume boost to 150% (mpv); per-profile Startup (Home / Last channel / Live·Favorites)
- Detailed channel search (category · number); Animations simplified to On/Off

Live TV:
- Closed captions (CEA-608/708) on Live TV
- Per-channel "compatibility mode" (pin a channel to mpv) + synchronous codec queueing for UHD
- Semi-auto EPG sync after import (live progress) — now also shows in the EPG list

Plus clear watch history, A/V-sync nudge, in-player channel list, robust Xtream import, donation link.
</commit_message>
<xml_diff>
--- a/extras/OwnTV_Complete_Brief_Plan_With_Logo.docx
+++ b/extras/OwnTV_Complete_Brief_Plan_With_Logo.docx
@@ -63,7 +63,7 @@
         <w:rPr>
           <w:rFonts w:ascii="Cambria" w:hAnsi="Cambria" w:eastAsia="Cambria" w:cs="Cambria"/>
         </w:rPr>
-        <w:t>Native Android TV IPTV Player  •  As-built, v3.2.0</w:t>
+        <w:t>Native Android TV IPTV Player  •  As-built, v4.0.0</w:t>
       </w:r>
       <w:r>
         <w:rPr>
@@ -1466,6 +1466,38 @@
     </w:p>
     <w:p>
       <w:pPr>
+        <w:pStyle w:val="723"/>
+      </w:pPr>
+      <w:r>
+        <w:t>Closed captions (CC) on Live TV: channels that embed CEA-608/708 captions in the video stream (e.g. US channels like HBO/Showtime/Cinemax) now expose a selectable caption track in the Subtitles menu instead of only "Off" — ExoPlayer via DefaultHlsExtractorFactory(exposeCea608WhenMissingDeclarations), with mpv's sub-create-cc-track as the raw-TS / fallback net.</w:t>
+      </w:r>
+    </w:p>
+    <w:p>
+      <w:pPr>
+        <w:pStyle w:val="723"/>
+      </w:pPr>
+      <w:r>
+        <w:t>Per-channel compatibility mode: a gear toggle in the live HUD pins a channel to the mpv engine (fixes UHD-HEVC artifacts and streams ExoPlayer can't decode), remembered per channel by stream URL so it opens straight on mpv every time after — while other channels keep the near-instant ExoPlayer start. ExoPlayer also runs MediaCodec synchronously (forceDisableMediaCodecAsynchronousQueueing) to cut UHD artifacts at the source.</w:t>
+      </w:r>
+    </w:p>
+    <w:p>
+      <w:pPr>
+        <w:pStyle w:val="723"/>
+      </w:pPr>
+      <w:r>
+        <w:t>Stream technical info overlay: an info button in the player shows a live readout — video codec/resolution/fps/bit-depth, HDR type, bitrate, decoder (hw/sw, direct), audio codec/channels/rate, buffer &amp; dropped frames, and the credential-masked source; works on both engines.</w:t>
+      </w:r>
+    </w:p>
+    <w:p>
+      <w:pPr>
+        <w:pStyle w:val="723"/>
+      </w:pPr>
+      <w:r>
+        <w:t>Volume boost to 150%: movies, series and any mpv-played channel can amplify above 100% (Kodi-style, capped at 150% with mpv's soft limiter) for quiet streams. The ExoPlayer live engine stays at 100%.</w:t>
+      </w:r>
+    </w:p>
+    <w:p>
+      <w:pPr>
         <w:pStyle w:val="693"/>
         <w:pBdr/>
         <w:spacing/>
@@ -3663,6 +3695,118 @@
       </w:pPr>
       <w:r>
         <w:t>v3.2.0 - Audio-track icon redrawn as a music note (OwnTVIcon.AUDIO) so it's no longer confused with the speaker/volume button.</w:t>
+      </w:r>
+    </w:p>
+    <w:p>
+      <w:pPr>
+        <w:pStyle w:val="694"/>
+      </w:pPr>
+      <w:r>
+        <w:t>12.21 v4.0.0: EPG speed &amp; resilience, TV-first navigation, list view, import robustness</w:t>
+      </w:r>
+    </w:p>
+    <w:p>
+      <w:pPr>
+        <w:pStyle w:val="723"/>
+      </w:pPr>
+      <w:r>
+        <w:t>v4.0.0 — Much faster, lighter EPG sync: the guide now stores programmes only for the channels you actually have (public XMLTV feeds carry ~10–20× more), parsed while streaming and mirrored to a 24h local cache file; a smart-match then tops up that channel's programmes instantly from the cache with no network round-trip.</w:t>
+      </w:r>
+    </w:p>
+    <w:p>
+      <w:pPr>
+        <w:pStyle w:val="723"/>
+      </w:pPr>
+      <w:r>
+        <w:t>v4.0.0 — Guide opens instantly: the EpgViewModel is pre-loaded in the background at startup and keeps its list across re-entry (no spinner/rebuild on every open). A permanent epg_programmes(sourceId, epgChannelId) index — ensured at startup and after each sync via CREATE INDEX IF NOT EXISTS — turns the 'channels with guide' lookup from a multi-second scan into an index scan; the match-apply path was de-stormed (one bulk query instead of two per match).</w:t>
+      </w:r>
+    </w:p>
+    <w:p>
+      <w:pPr>
+        <w:pStyle w:val="723"/>
+      </w:pPr>
+      <w:r>
+        <w:t>v4.0.0 — EPG no longer dies on a malformed feed: KXmlParser relaxed mode plus a tolerant text reader (replacing nextText) and a salvage-partial path mean one bad &lt;programme&gt;/&lt;title&gt; tag no longer aborts the whole sync with 'END_TAG expected'.</w:t>
+      </w:r>
+    </w:p>
+    <w:p>
+      <w:pPr>
+        <w:pStyle w:val="723"/>
+      </w:pPr>
+      <w:r>
+        <w:t>v4.0.0 — Resilient Xtream imports: a provider that errors on the bulk get_series/get_vod (a non-standard HTTP 512 = Xui.one/WAF 'response too large') now falls back to per-category requests (paced ~150ms to avoid rate-limits, skipping a failing category and continuing). Movies/Series steps are non-fatal so the channels still import, and credentials are redacted from HTTP error messages.</w:t>
+      </w:r>
+    </w:p>
+    <w:p>
+      <w:pPr>
+        <w:pStyle w:val="723"/>
+      </w:pPr>
+      <w:r>
+        <w:t>v4.0.0 — In-player channel list: while a live channel plays full-screen with the controls hidden, Left slides a channel list over the video to switch channels without leaving full-screen (Back / Left again closes it).</w:t>
+      </w:r>
+    </w:p>
+    <w:p>
+      <w:pPr>
+        <w:pStyle w:val="723"/>
+      </w:pPr>
+      <w:r>
+        <w:t>v4.0.0 — Live TV remembers where you were: it reopens on the last selected category and lands focus on the last channel you were on; an opt-in 'Resume last channel on startup' (Settings → Playback, default off) reopens straight into it.</w:t>
+      </w:r>
+    </w:p>
+    <w:p>
+      <w:pPr>
+        <w:pStyle w:val="723"/>
+      </w:pPr>
+      <w:r>
+        <w:t>v4.0.0 — Guide filters: the guide's sort gained a Favorites option (just your favourited channels), plus a Category filter with its own search box to view one group at a time.</w:t>
+      </w:r>
+    </w:p>
+    <w:p>
+      <w:pPr>
+        <w:pStyle w:val="723"/>
+      </w:pPr>
+      <w:r>
+        <w:t>v4.0.0 — Movies &amp; Series Grid/List view toggle: switch the poster wall to a compact list to see far more titles at once.</w:t>
+      </w:r>
+    </w:p>
+    <w:p>
+      <w:pPr>
+        <w:pStyle w:val="723"/>
+      </w:pPr>
+      <w:r>
+        <w:t>v4.0.0 — Clear watch history: wipe a profile's recently-watched / continue rows — all of it, or just Live TV / Movies / Series — behind a confirm; playlists, favorites and downloads are untouched.</w:t>
+      </w:r>
+    </w:p>
+    <w:p>
+      <w:pPr>
+        <w:pStyle w:val="723"/>
+      </w:pPr>
+      <w:r>
+        <w:t>v4.0.0 — Quality-of-life: favorite a channel from global search via long-press; jump a Customize category straight to the top/bottom (alongside one-step up/down); an Animations setting (Full / Reduced / Off) to tone down motion on lower-end TV boxes.</w:t>
+      </w:r>
+    </w:p>
+    <w:p>
+      <w:pPr>
+        <w:pStyle w:val="723"/>
+      </w:pPr>
+      <w:r>
+        <w:t>v4.0.0 — Screensaver restore: pausing a movie/episode and leaving the TV long enough for the screensaver no longer leaves a dead stream — the app restores it paused at the exact position on return, so Play just resumes.</w:t>
+      </w:r>
+    </w:p>
+    <w:p>
+      <w:pPr>
+        <w:pStyle w:val="723"/>
+      </w:pPr>
+      <w:r>
+        <w:t>v4.0.0 — Project: added GitHub issue templates (bug report asking for the on-screen 'err:' line / screenshot / duplicate &amp; settings checks, feature request, Telegram contact link) and an enhanced PR template stressing real-TV testing.</w:t>
+      </w:r>
+    </w:p>
+    <w:p>
+      <w:pPr>
+        <w:pStyle w:val="723"/>
+      </w:pPr>
+      <w:r>
+        <w:t>v4.0.0 — UI upgrade (3 phases): Phase 1 stream-info overlay + volume boost; Phase 2 the FIXED grid — fixed icon nav + full-label category column + fixed Live panes, no expand/collapse so the layout never jumps on the D-pad (faster on low-end boxes), profile-avatar click switches profile; Phase 3 per-profile Startup (Home / Last channel / Live·Favorites) and detailed channel search results (category, channel number). Animations setting simplified to On/Off.</w:t>
       </w:r>
     </w:p>
     <w:sectPr>

</xml_diff>